<commit_message>
docs: VIA build story, including the gateway outage
Adds the dev.to build story with six findings from Tender and Privoice:
the enterprise-address consequence, VIA Scan's 0x rule, testnet
confirmation depth, contract custody rejected with Custom(192), the
signRecipe requirement, and the 2 Sep gateway outage with both stuck
message ids and how the submission was handled while blocked.
</commit_message>
<xml_diff>
--- a/docs/VIA Build Story - Five Things I Learned.docx
+++ b/docs/VIA Build Story - Five Things I Learned.docx
@@ -1428,6 +1428,249 @@
       </w:pPr>
       <w:r>
         <w:rPr/>
+        <w:t xml:space="preserve">6. When the gateway stops, there is no other way to get USDM</w:t>
+      </w:r>
+    </w:p>
+    <w:p>
+      <w:pPr>
+        <w:spacing w:after="160"/>
+      </w:pPr>
+      <w:r>
+        <w:rPr/>
+        <w:t xml:space="preserve">USDM is minted on Midnight </w:t>
+      </w:r>
+      <w:r>
+        <w:rPr>
+          <w:b/>
+        </w:rPr>
+        <w:t xml:space="preserve">solely</w:t>
+      </w:r>
+      <w:r>
+        <w:rPr/>
+        <w:t xml:space="preserve"> by VIA's cross-chain gateway delivering a message from Cardano. No faucet, no other issuance path. Which means if that gateway stops delivering, you cannot get USDM on Preview at all — and I found that out with a submission deadline in front of me.</w:t>
+      </w:r>
+    </w:p>
+    <w:p>
+      <w:pPr>
+        <w:spacing w:after="160"/>
+      </w:pPr>
+      <w:r>
+        <w:rPr/>
+        <w:t xml:space="preserve">On 2 September I sent 10 USDM from my own bridge UI at 12:15 MDT. Nothing arrived. An hour later I sent 1 USDM using </w:t>
+      </w:r>
+      <w:r>
+        <w:rPr>
+          <w:b/>
+        </w:rPr>
+        <w:t xml:space="preserve">VIA's own CLI</w:t>
+      </w:r>
+      <w:r>
+        <w:rPr/>
+        <w:t xml:space="preserve"> as a control, to rule out my code. Both sat at *Awaiting Attestation*.</w:t>
+      </w:r>
+    </w:p>
+    <w:p>
+      <w:pPr>
+        <w:spacing w:after="160"/>
+      </w:pPr>
+      <w:r>
+        <w:rPr/>
+        <w:t xml:space="preserve">The evidence said it was not me:</w:t>
+      </w:r>
+    </w:p>
+    <w:p>
+      <w:pPr>
+        <w:numPr>
+          <w:ilvl w:val="0"/>
+          <w:numId w:val="1"/>
+        </w:numPr>
+        <w:spacing w:after="60"/>
+      </w:pPr>
+      <w:r>
+        <w:rPr/>
+        <w:t xml:space="preserve">Both messages carried routing values matching VIA's published testnet table — chain ids </w:t>
+      </w:r>
+      <w:r>
+        <w:rPr>
+          <w:rFonts w:ascii="Consolas" w:hAnsi="Consolas"/>
+          <w:sz w:val="19"/>
+        </w:rPr>
+        <w:t xml:space="preserve">2273266 → 64364450</w:t>
+      </w:r>
+      <w:r>
+        <w:rPr/>
+        <w:t xml:space="preserve">, gateway </w:t>
+      </w:r>
+      <w:r>
+        <w:rPr>
+          <w:rFonts w:ascii="Consolas" w:hAnsi="Consolas"/>
+          <w:sz w:val="19"/>
+        </w:rPr>
+        <w:t xml:space="preserve">471dfe55…e73e485c</w:t>
+      </w:r>
+      <w:r>
+        <w:rPr/>
+        <w:t xml:space="preserve">, token colour </w:t>
+      </w:r>
+      <w:r>
+        <w:rPr>
+          <w:rFonts w:ascii="Consolas" w:hAnsi="Consolas"/>
+          <w:sz w:val="19"/>
+        </w:rPr>
+        <w:t xml:space="preserve">003bacd9…947d73</w:t>
+      </w:r>
+    </w:p>
+    <w:p>
+      <w:pPr>
+        <w:numPr>
+          <w:ilvl w:val="0"/>
+          <w:numId w:val="1"/>
+        </w:numPr>
+        <w:spacing w:after="60"/>
+      </w:pPr>
+      <w:r>
+        <w:rPr/>
+        <w:t xml:space="preserve">Both </w:t>
+      </w:r>
+      <w:r>
+        <w:rPr>
+          <w:rFonts w:ascii="Consolas" w:hAnsi="Consolas"/>
+          <w:sz w:val="19"/>
+        </w:rPr>
+        <w:t xml:space="preserve">destinationRecipient</w:t>
+      </w:r>
+      <w:r>
+        <w:rPr/>
+        <w:t xml:space="preserve"> fields decoded to my own address</w:t>
+      </w:r>
+    </w:p>
+    <w:p>
+      <w:pPr>
+        <w:numPr>
+          <w:ilvl w:val="0"/>
+          <w:numId w:val="1"/>
+        </w:numPr>
+        <w:spacing w:after="60"/>
+      </w:pPr>
+      <w:r>
+        <w:rPr/>
+        <w:t xml:space="preserve">Cardano Preprod was healthy — the tip was ~260 blocks past my lock</w:t>
+      </w:r>
+    </w:p>
+    <w:p>
+      <w:pPr>
+        <w:numPr>
+          <w:ilvl w:val="0"/>
+          <w:numId w:val="1"/>
+        </w:numPr>
+        <w:spacing w:after="60"/>
+      </w:pPr>
+      <w:r>
+        <w:rPr/>
+        <w:t xml:space="preserve">The docs say testnet attests after </w:t>
+      </w:r>
+      <w:r>
+        <w:rPr>
+          <w:b/>
+        </w:rPr>
+        <w:t xml:space="preserve">1 block</w:t>
+      </w:r>
+      <w:r>
+        <w:rPr/>
+        <w:t xml:space="preserve">, and my 29 August transfer on the same route delivered in </w:t>
+      </w:r>
+      <w:r>
+        <w:rPr>
+          <w:b/>
+        </w:rPr>
+        <w:t xml:space="preserve">1m 52s</w:t>
+      </w:r>
+    </w:p>
+    <w:p>
+      <w:pPr>
+        <w:numPr>
+          <w:ilvl w:val="0"/>
+          <w:numId w:val="1"/>
+        </w:numPr>
+        <w:spacing w:after="60"/>
+      </w:pPr>
+      <w:r>
+        <w:rPr/>
+        <w:t xml:space="preserve">On VIA's global message feed, the last delivered message on that route was ~24 hours old. Mine were the only two since.</w:t>
+      </w:r>
+    </w:p>
+    <w:p>
+      <w:pPr>
+        <w:spacing w:after="160"/>
+      </w:pPr>
+      <w:r>
+        <w:rPr/>
+        <w:t xml:space="preserve">Two independent clients, two package versions, ninety minutes apart, identical failure. That is about as clean a "not my code" result as you get.</w:t>
+      </w:r>
+    </w:p>
+    <w:p>
+      <w:pPr>
+        <w:spacing w:after="160"/>
+      </w:pPr>
+      <w:r>
+        <w:rPr/>
+        <w:t xml:space="preserve">So I shipped anyway, and documented it. The payment leg is a parameter — one 32-byte token colour — so I ran the settlement with NIGHT instead, and the README said exactly that: which token moved, which token the code defaults to, why the substitution was necessary, and both stuck message ids so a reviewer could check the claim themselves in thirty seconds.</w:t>
+      </w:r>
+    </w:p>
+    <w:p>
+      <w:pPr>
+        <w:spacing w:after="160"/>
+      </w:pPr>
+      <w:r>
+        <w:rPr/>
+        <w:t xml:space="preserve">The next morning both messages delivered — </w:t>
+      </w:r>
+      <w:r>
+        <w:rPr>
+          <w:b/>
+        </w:rPr>
+        <w:t xml:space="preserve">16h 32m</w:t>
+      </w:r>
+      <w:r>
+        <w:rPr/>
+        <w:t xml:space="preserve"> and </w:t>
+      </w:r>
+      <w:r>
+        <w:rPr>
+          <w:b/>
+        </w:rPr>
+        <w:t xml:space="preserve">15h 4m</w:t>
+      </w:r>
+      <w:r>
+        <w:rPr/>
+        <w:t xml:space="preserve">. VIA's scanner still labels those "normal". I re-ran the lifecycle with real USDM, paying a second address rather than my own, and removed the substitution note from the README, because it had stopped being true.</w:t>
+      </w:r>
+    </w:p>
+    <w:p>
+      <w:pPr>
+        <w:spacing w:after="160"/>
+      </w:pPr>
+      <w:r>
+        <w:rPr/>
+        <w:t xml:space="preserve">Two things I would take from that. </w:t>
+      </w:r>
+      <w:r>
+        <w:rPr>
+          <w:b/>
+        </w:rPr>
+        <w:t xml:space="preserve">Delivery time on Preprod → Preview is not something to plan around</w:t>
+      </w:r>
+      <w:r>
+        <w:rPr/>
+        <w:t xml:space="preserve"> — the documented rule is one block and I saw sixteen hours. And when you are blocked by someone else's infrastructure, the move is to make the blocker verifiable rather than quietly omit it. Naming it cost nothing and would have survived review either way.</w:t>
+      </w:r>
+    </w:p>
+    <w:p>
+      <w:pPr>
+        <w:pStyle w:val="Heading2"/>
+      </w:pPr>
+      <w:r>
+        <w:rPr/>
         <w:t xml:space="preserve">Two smaller ones, for whoever hits them next</w:t>
       </w:r>
     </w:p>

</xml_diff>